<commit_message>
chore(rules): Naming Rule V1.1 and the two RAMs as two blocks
Tâm confirmed both open points on 2026-09-28.

Naming Rule V1.1 (the .docx):
- Rule 2.1 and the 4.3 checklist now read m_qnsc_wrap_<ip>, where <ip> is
  the IP's short name as the chip contract names it, not the vendor module
  name.
- The examples are cpu, uart, timer, isram and dsram.
- The revision table has a 1.1 row.
- naming_rules.yml, naming_check.py, the CI step names and the guides now
  say V1.1. The PDF is exported from the .docx separately.

One IP in two configurations becomes two blocks:
- design/ram is split into design/isram (m_qnsc_wrap_isram, depth 16384)
  and design/dsram (m_qnsc_wrap_dsram, depth 8192). Each has its own
  filelist and dv directory; one MAS covers both.
- design/README records the decision and drops the "Pending with Tâm"
  section.
- WRAP-NAME now requires exactly m_qnsc_wrap_<block>.
- TRACKER, the ROM README and the labeler are updated to match.
</commit_message>
<xml_diff>
--- a/doc/rules/QNSC_RTL_Design_Naming_Rule.docx
+++ b/doc/rules/QNSC_RTL_Design_Naming_Rule.docx
@@ -55,35 +55,7 @@
           <w:sz w:val="24"/>
           <w:szCs w:val="24"/>
         </w:rPr>
-        <w:t>This document defines mand</w:t>
-      </w:r>
-      <w:r>
-        <w:rPr>
-          <w:sz w:val="24"/>
-          <w:szCs w:val="24"/>
-        </w:rPr>
-        <w:t>atory naming rules for</w:t>
-      </w:r>
-      <w:r>
-        <w:rPr>
-          <w:sz w:val="24"/>
-          <w:szCs w:val="24"/>
-        </w:rPr>
-        <w:t xml:space="preserve"> RTL</w:t>
-      </w:r>
-      <w:r>
-        <w:rPr>
-          <w:sz w:val="24"/>
-          <w:szCs w:val="24"/>
-        </w:rPr>
-        <w:t xml:space="preserve"> design</w:t>
-      </w:r>
-      <w:r>
-        <w:rPr>
-          <w:sz w:val="24"/>
-          <w:szCs w:val="24"/>
-        </w:rPr>
-        <w:t>. The rules apply to modules, instances, ports, internal signals, constants, and integration interfaces. Exceptions shall be explicitly reviewed and agreed before implementation.</w:t>
+        <w:t xml:space="preserve">This document defines mandatory naming rules for RTL design. The rules apply to modules, instances, ports, internal signals, constants, and integration interfaces. Exceptions shall be explicitly reviewed and agreed before implementation.</w:t>
       </w:r>
     </w:p>
     <w:p>
@@ -110,28 +82,7 @@
           <w:sz w:val="38"/>
           <w:szCs w:val="38"/>
         </w:rPr>
-        <w:t>V</w:t>
-      </w:r>
-      <w:r>
-        <w:rPr>
-          <w:sz w:val="38"/>
-          <w:szCs w:val="38"/>
-        </w:rPr>
-        <w:t>1</w:t>
-      </w:r>
-      <w:r>
-        <w:rPr>
-          <w:sz w:val="38"/>
-          <w:szCs w:val="38"/>
-        </w:rPr>
-        <w:t>.</w:t>
-      </w:r>
-      <w:r>
-        <w:rPr>
-          <w:sz w:val="38"/>
-          <w:szCs w:val="38"/>
-        </w:rPr>
-        <w:t>0</w:t>
+        <w:t>V1.1</w:t>
       </w:r>
     </w:p>
     <w:p>
@@ -155,19 +106,7 @@
         </w:rPr>
         <w:lastRenderedPageBreak/>
         <w:fldChar w:fldCharType="begin"/>
-      </w:r>
-      <w:r>
-        <w:rPr>
-          <w:rFonts w:asciiTheme="majorHAnsi" w:hAnsiTheme="majorHAnsi"/>
-          <w:sz w:val="24"/>
-        </w:rPr>
         <w:instrText xml:space="preserve"> TOC \o "1-3" \h \z \u </w:instrText>
-      </w:r>
-      <w:r>
-        <w:rPr>
-          <w:rFonts w:asciiTheme="majorHAnsi" w:hAnsiTheme="majorHAnsi"/>
-          <w:sz w:val="24"/>
-        </w:rPr>
         <w:fldChar w:fldCharType="separate"/>
       </w:r>
     </w:p>
@@ -226,11 +165,7 @@
           </w:pPr>
           <w:r>
             <w:fldChar w:fldCharType="begin"/>
-          </w:r>
-          <w:r>
             <w:instrText xml:space="preserve"> TOC \o "1-3" \h \z \u </w:instrText>
-          </w:r>
-          <w:r>
             <w:fldChar w:fldCharType="separate"/>
           </w:r>
           <w:hyperlink w:anchor="_Toc240406063" w:history="1">
@@ -247,26 +182,8 @@
                 <w:webHidden/>
               </w:rPr>
               <w:tab/>
-            </w:r>
-            <w:r>
-              <w:rPr>
-                <w:noProof/>
-                <w:webHidden/>
-              </w:rPr>
               <w:fldChar w:fldCharType="begin"/>
-            </w:r>
-            <w:r>
-              <w:rPr>
-                <w:noProof/>
-                <w:webHidden/>
-              </w:rPr>
               <w:instrText xml:space="preserve"> PAGEREF _Toc240406063 \h </w:instrText>
-            </w:r>
-            <w:r>
-              <w:rPr>
-                <w:noProof/>
-                <w:webHidden/>
-              </w:rPr>
               <w:fldChar w:fldCharType="separate"/>
             </w:r>
             <w:r>
@@ -337,46 +254,10 @@
                 <w:webHidden/>
               </w:rPr>
               <w:tab/>
-            </w:r>
-            <w:r>
-              <w:rPr>
-                <w:noProof/>
-                <w:webHidden/>
-              </w:rPr>
               <w:fldChar w:fldCharType="begin"/>
-            </w:r>
-            <w:r>
-              <w:rPr>
-                <w:noProof/>
-                <w:webHidden/>
-              </w:rPr>
               <w:instrText xml:space="preserve"> PAGEREF _Toc240406064 \h </w:instrText>
-            </w:r>
-            <w:r>
-              <w:rPr>
-                <w:noProof/>
-                <w:webHidden/>
-              </w:rPr>
-            </w:r>
-            <w:r>
-              <w:rPr>
-                <w:noProof/>
-                <w:webHidden/>
-              </w:rPr>
               <w:fldChar w:fldCharType="separate"/>
-            </w:r>
-            <w:r>
-              <w:rPr>
-                <w:noProof/>
-                <w:webHidden/>
-              </w:rPr>
               <w:t>6</w:t>
-            </w:r>
-            <w:r>
-              <w:rPr>
-                <w:noProof/>
-                <w:webHidden/>
-              </w:rPr>
               <w:fldChar w:fldCharType="end"/>
             </w:r>
           </w:hyperlink>
@@ -428,46 +309,10 @@
                 <w:webHidden/>
               </w:rPr>
               <w:tab/>
-            </w:r>
-            <w:r>
-              <w:rPr>
-                <w:noProof/>
-                <w:webHidden/>
-              </w:rPr>
               <w:fldChar w:fldCharType="begin"/>
-            </w:r>
-            <w:r>
-              <w:rPr>
-                <w:noProof/>
-                <w:webHidden/>
-              </w:rPr>
               <w:instrText xml:space="preserve"> PAGEREF _Toc240406065 \h </w:instrText>
-            </w:r>
-            <w:r>
-              <w:rPr>
-                <w:noProof/>
-                <w:webHidden/>
-              </w:rPr>
-            </w:r>
-            <w:r>
-              <w:rPr>
-                <w:noProof/>
-                <w:webHidden/>
-              </w:rPr>
               <w:fldChar w:fldCharType="separate"/>
-            </w:r>
-            <w:r>
-              <w:rPr>
-                <w:noProof/>
-                <w:webHidden/>
-              </w:rPr>
               <w:t>6</w:t>
-            </w:r>
-            <w:r>
-              <w:rPr>
-                <w:noProof/>
-                <w:webHidden/>
-              </w:rPr>
               <w:fldChar w:fldCharType="end"/>
             </w:r>
           </w:hyperlink>
@@ -519,46 +364,10 @@
                 <w:webHidden/>
               </w:rPr>
               <w:tab/>
-            </w:r>
-            <w:r>
-              <w:rPr>
-                <w:noProof/>
-                <w:webHidden/>
-              </w:rPr>
               <w:fldChar w:fldCharType="begin"/>
-            </w:r>
-            <w:r>
-              <w:rPr>
-                <w:noProof/>
-                <w:webHidden/>
-              </w:rPr>
               <w:instrText xml:space="preserve"> PAGEREF _Toc240406066 \h </w:instrText>
-            </w:r>
-            <w:r>
-              <w:rPr>
-                <w:noProof/>
-                <w:webHidden/>
-              </w:rPr>
-            </w:r>
-            <w:r>
-              <w:rPr>
-                <w:noProof/>
-                <w:webHidden/>
-              </w:rPr>
               <w:fldChar w:fldCharType="separate"/>
-            </w:r>
-            <w:r>
-              <w:rPr>
-                <w:noProof/>
-                <w:webHidden/>
-              </w:rPr>
               <w:t>6</w:t>
-            </w:r>
-            <w:r>
-              <w:rPr>
-                <w:noProof/>
-                <w:webHidden/>
-              </w:rPr>
               <w:fldChar w:fldCharType="end"/>
             </w:r>
           </w:hyperlink>
@@ -610,46 +419,10 @@
                 <w:webHidden/>
               </w:rPr>
               <w:tab/>
-            </w:r>
-            <w:r>
-              <w:rPr>
-                <w:noProof/>
-                <w:webHidden/>
-              </w:rPr>
               <w:fldChar w:fldCharType="begin"/>
-            </w:r>
-            <w:r>
-              <w:rPr>
-                <w:noProof/>
-                <w:webHidden/>
-              </w:rPr>
               <w:instrText xml:space="preserve"> PAGEREF _Toc240406067 \h </w:instrText>
-            </w:r>
-            <w:r>
-              <w:rPr>
-                <w:noProof/>
-                <w:webHidden/>
-              </w:rPr>
-            </w:r>
-            <w:r>
-              <w:rPr>
-                <w:noProof/>
-                <w:webHidden/>
-              </w:rPr>
               <w:fldChar w:fldCharType="separate"/>
-            </w:r>
-            <w:r>
-              <w:rPr>
-                <w:noProof/>
-                <w:webHidden/>
-              </w:rPr>
               <w:t>7</w:t>
-            </w:r>
-            <w:r>
-              <w:rPr>
-                <w:noProof/>
-                <w:webHidden/>
-              </w:rPr>
               <w:fldChar w:fldCharType="end"/>
             </w:r>
           </w:hyperlink>
@@ -701,46 +474,10 @@
                 <w:webHidden/>
               </w:rPr>
               <w:tab/>
-            </w:r>
-            <w:r>
-              <w:rPr>
-                <w:noProof/>
-                <w:webHidden/>
-              </w:rPr>
               <w:fldChar w:fldCharType="begin"/>
-            </w:r>
-            <w:r>
-              <w:rPr>
-                <w:noProof/>
-                <w:webHidden/>
-              </w:rPr>
               <w:instrText xml:space="preserve"> PAGEREF _Toc240406068 \h </w:instrText>
-            </w:r>
-            <w:r>
-              <w:rPr>
-                <w:noProof/>
-                <w:webHidden/>
-              </w:rPr>
-            </w:r>
-            <w:r>
-              <w:rPr>
-                <w:noProof/>
-                <w:webHidden/>
-              </w:rPr>
               <w:fldChar w:fldCharType="separate"/>
-            </w:r>
-            <w:r>
-              <w:rPr>
-                <w:noProof/>
-                <w:webHidden/>
-              </w:rPr>
               <w:t>7</w:t>
-            </w:r>
-            <w:r>
-              <w:rPr>
-                <w:noProof/>
-                <w:webHidden/>
-              </w:rPr>
               <w:fldChar w:fldCharType="end"/>
             </w:r>
           </w:hyperlink>
@@ -792,46 +529,10 @@
                 <w:webHidden/>
               </w:rPr>
               <w:tab/>
-            </w:r>
-            <w:r>
-              <w:rPr>
-                <w:noProof/>
-                <w:webHidden/>
-              </w:rPr>
               <w:fldChar w:fldCharType="begin"/>
-            </w:r>
-            <w:r>
-              <w:rPr>
-                <w:noProof/>
-                <w:webHidden/>
-              </w:rPr>
               <w:instrText xml:space="preserve"> PAGEREF _Toc240406069 \h </w:instrText>
-            </w:r>
-            <w:r>
-              <w:rPr>
-                <w:noProof/>
-                <w:webHidden/>
-              </w:rPr>
-            </w:r>
-            <w:r>
-              <w:rPr>
-                <w:noProof/>
-                <w:webHidden/>
-              </w:rPr>
               <w:fldChar w:fldCharType="separate"/>
-            </w:r>
-            <w:r>
-              <w:rPr>
-                <w:noProof/>
-                <w:webHidden/>
-              </w:rPr>
               <w:t>7</w:t>
-            </w:r>
-            <w:r>
-              <w:rPr>
-                <w:noProof/>
-                <w:webHidden/>
-              </w:rPr>
               <w:fldChar w:fldCharType="end"/>
             </w:r>
           </w:hyperlink>
@@ -886,46 +587,10 @@
                 <w:webHidden/>
               </w:rPr>
               <w:tab/>
-            </w:r>
-            <w:r>
-              <w:rPr>
-                <w:noProof/>
-                <w:webHidden/>
-              </w:rPr>
               <w:fldChar w:fldCharType="begin"/>
-            </w:r>
-            <w:r>
-              <w:rPr>
-                <w:noProof/>
-                <w:webHidden/>
-              </w:rPr>
               <w:instrText xml:space="preserve"> PAGEREF _Toc240406070 \h </w:instrText>
-            </w:r>
-            <w:r>
-              <w:rPr>
-                <w:noProof/>
-                <w:webHidden/>
-              </w:rPr>
-            </w:r>
-            <w:r>
-              <w:rPr>
-                <w:noProof/>
-                <w:webHidden/>
-              </w:rPr>
               <w:fldChar w:fldCharType="separate"/>
-            </w:r>
-            <w:r>
-              <w:rPr>
-                <w:noProof/>
-                <w:webHidden/>
-              </w:rPr>
               <w:t>10</w:t>
-            </w:r>
-            <w:r>
-              <w:rPr>
-                <w:noProof/>
-                <w:webHidden/>
-              </w:rPr>
               <w:fldChar w:fldCharType="end"/>
             </w:r>
           </w:hyperlink>
@@ -977,46 +642,10 @@
                 <w:webHidden/>
               </w:rPr>
               <w:tab/>
-            </w:r>
-            <w:r>
-              <w:rPr>
-                <w:noProof/>
-                <w:webHidden/>
-              </w:rPr>
               <w:fldChar w:fldCharType="begin"/>
-            </w:r>
-            <w:r>
-              <w:rPr>
-                <w:noProof/>
-                <w:webHidden/>
-              </w:rPr>
               <w:instrText xml:space="preserve"> PAGEREF _Toc240406071 \h </w:instrText>
-            </w:r>
-            <w:r>
-              <w:rPr>
-                <w:noProof/>
-                <w:webHidden/>
-              </w:rPr>
-            </w:r>
-            <w:r>
-              <w:rPr>
-                <w:noProof/>
-                <w:webHidden/>
-              </w:rPr>
               <w:fldChar w:fldCharType="separate"/>
-            </w:r>
-            <w:r>
-              <w:rPr>
-                <w:noProof/>
-                <w:webHidden/>
-              </w:rPr>
               <w:t>10</w:t>
-            </w:r>
-            <w:r>
-              <w:rPr>
-                <w:noProof/>
-                <w:webHidden/>
-              </w:rPr>
               <w:fldChar w:fldCharType="end"/>
             </w:r>
           </w:hyperlink>
@@ -1068,46 +697,10 @@
                 <w:webHidden/>
               </w:rPr>
               <w:tab/>
-            </w:r>
-            <w:r>
-              <w:rPr>
-                <w:noProof/>
-                <w:webHidden/>
-              </w:rPr>
               <w:fldChar w:fldCharType="begin"/>
-            </w:r>
-            <w:r>
-              <w:rPr>
-                <w:noProof/>
-                <w:webHidden/>
-              </w:rPr>
               <w:instrText xml:space="preserve"> PAGEREF _Toc240406072 \h </w:instrText>
-            </w:r>
-            <w:r>
-              <w:rPr>
-                <w:noProof/>
-                <w:webHidden/>
-              </w:rPr>
-            </w:r>
-            <w:r>
-              <w:rPr>
-                <w:noProof/>
-                <w:webHidden/>
-              </w:rPr>
               <w:fldChar w:fldCharType="separate"/>
-            </w:r>
-            <w:r>
-              <w:rPr>
-                <w:noProof/>
-                <w:webHidden/>
-              </w:rPr>
               <w:t>10</w:t>
-            </w:r>
-            <w:r>
-              <w:rPr>
-                <w:noProof/>
-                <w:webHidden/>
-              </w:rPr>
               <w:fldChar w:fldCharType="end"/>
             </w:r>
           </w:hyperlink>
@@ -1159,46 +752,10 @@
                 <w:webHidden/>
               </w:rPr>
               <w:tab/>
-            </w:r>
-            <w:r>
-              <w:rPr>
-                <w:noProof/>
-                <w:webHidden/>
-              </w:rPr>
               <w:fldChar w:fldCharType="begin"/>
-            </w:r>
-            <w:r>
-              <w:rPr>
-                <w:noProof/>
-                <w:webHidden/>
-              </w:rPr>
               <w:instrText xml:space="preserve"> PAGEREF _Toc240406073 \h </w:instrText>
-            </w:r>
-            <w:r>
-              <w:rPr>
-                <w:noProof/>
-                <w:webHidden/>
-              </w:rPr>
-            </w:r>
-            <w:r>
-              <w:rPr>
-                <w:noProof/>
-                <w:webHidden/>
-              </w:rPr>
               <w:fldChar w:fldCharType="separate"/>
-            </w:r>
-            <w:r>
-              <w:rPr>
-                <w:noProof/>
-                <w:webHidden/>
-              </w:rPr>
               <w:t>11</w:t>
-            </w:r>
-            <w:r>
-              <w:rPr>
-                <w:noProof/>
-                <w:webHidden/>
-              </w:rPr>
               <w:fldChar w:fldCharType="end"/>
             </w:r>
           </w:hyperlink>
@@ -1250,46 +807,10 @@
                 <w:webHidden/>
               </w:rPr>
               <w:tab/>
-            </w:r>
-            <w:r>
-              <w:rPr>
-                <w:noProof/>
-                <w:webHidden/>
-              </w:rPr>
               <w:fldChar w:fldCharType="begin"/>
-            </w:r>
-            <w:r>
-              <w:rPr>
-                <w:noProof/>
-                <w:webHidden/>
-              </w:rPr>
               <w:instrText xml:space="preserve"> PAGEREF _Toc240406074 \h </w:instrText>
-            </w:r>
-            <w:r>
-              <w:rPr>
-                <w:noProof/>
-                <w:webHidden/>
-              </w:rPr>
-            </w:r>
-            <w:r>
-              <w:rPr>
-                <w:noProof/>
-                <w:webHidden/>
-              </w:rPr>
               <w:fldChar w:fldCharType="separate"/>
-            </w:r>
-            <w:r>
-              <w:rPr>
-                <w:noProof/>
-                <w:webHidden/>
-              </w:rPr>
               <w:t>11</w:t>
-            </w:r>
-            <w:r>
-              <w:rPr>
-                <w:noProof/>
-                <w:webHidden/>
-              </w:rPr>
               <w:fldChar w:fldCharType="end"/>
             </w:r>
           </w:hyperlink>
@@ -1341,46 +862,10 @@
                 <w:webHidden/>
               </w:rPr>
               <w:tab/>
-            </w:r>
-            <w:r>
-              <w:rPr>
-                <w:noProof/>
-                <w:webHidden/>
-              </w:rPr>
               <w:fldChar w:fldCharType="begin"/>
-            </w:r>
-            <w:r>
-              <w:rPr>
-                <w:noProof/>
-                <w:webHidden/>
-              </w:rPr>
               <w:instrText xml:space="preserve"> PAGEREF _Toc240406075 \h </w:instrText>
-            </w:r>
-            <w:r>
-              <w:rPr>
-                <w:noProof/>
-                <w:webHidden/>
-              </w:rPr>
-            </w:r>
-            <w:r>
-              <w:rPr>
-                <w:noProof/>
-                <w:webHidden/>
-              </w:rPr>
               <w:fldChar w:fldCharType="separate"/>
-            </w:r>
-            <w:r>
-              <w:rPr>
-                <w:noProof/>
-                <w:webHidden/>
-              </w:rPr>
               <w:t>12</w:t>
-            </w:r>
-            <w:r>
-              <w:rPr>
-                <w:noProof/>
-                <w:webHidden/>
-              </w:rPr>
               <w:fldChar w:fldCharType="end"/>
             </w:r>
           </w:hyperlink>
@@ -1435,46 +920,10 @@
                 <w:webHidden/>
               </w:rPr>
               <w:tab/>
-            </w:r>
-            <w:r>
-              <w:rPr>
-                <w:noProof/>
-                <w:webHidden/>
-              </w:rPr>
               <w:fldChar w:fldCharType="begin"/>
-            </w:r>
-            <w:r>
-              <w:rPr>
-                <w:noProof/>
-                <w:webHidden/>
-              </w:rPr>
               <w:instrText xml:space="preserve"> PAGEREF _Toc240406076 \h </w:instrText>
-            </w:r>
-            <w:r>
-              <w:rPr>
-                <w:noProof/>
-                <w:webHidden/>
-              </w:rPr>
-            </w:r>
-            <w:r>
-              <w:rPr>
-                <w:noProof/>
-                <w:webHidden/>
-              </w:rPr>
               <w:fldChar w:fldCharType="separate"/>
-            </w:r>
-            <w:r>
-              <w:rPr>
-                <w:noProof/>
-                <w:webHidden/>
-              </w:rPr>
               <w:t>13</w:t>
-            </w:r>
-            <w:r>
-              <w:rPr>
-                <w:noProof/>
-                <w:webHidden/>
-              </w:rPr>
               <w:fldChar w:fldCharType="end"/>
             </w:r>
           </w:hyperlink>
@@ -1526,46 +975,10 @@
                 <w:webHidden/>
               </w:rPr>
               <w:tab/>
-            </w:r>
-            <w:r>
-              <w:rPr>
-                <w:noProof/>
-                <w:webHidden/>
-              </w:rPr>
               <w:fldChar w:fldCharType="begin"/>
-            </w:r>
-            <w:r>
-              <w:rPr>
-                <w:noProof/>
-                <w:webHidden/>
-              </w:rPr>
               <w:instrText xml:space="preserve"> PAGEREF _Toc240406077 \h </w:instrText>
-            </w:r>
-            <w:r>
-              <w:rPr>
-                <w:noProof/>
-                <w:webHidden/>
-              </w:rPr>
-            </w:r>
-            <w:r>
-              <w:rPr>
-                <w:noProof/>
-                <w:webHidden/>
-              </w:rPr>
               <w:fldChar w:fldCharType="separate"/>
-            </w:r>
-            <w:r>
-              <w:rPr>
-                <w:noProof/>
-                <w:webHidden/>
-              </w:rPr>
               <w:t>13</w:t>
-            </w:r>
-            <w:r>
-              <w:rPr>
-                <w:noProof/>
-                <w:webHidden/>
-              </w:rPr>
               <w:fldChar w:fldCharType="end"/>
             </w:r>
           </w:hyperlink>
@@ -1617,46 +1030,10 @@
                 <w:webHidden/>
               </w:rPr>
               <w:tab/>
-            </w:r>
-            <w:r>
-              <w:rPr>
-                <w:noProof/>
-                <w:webHidden/>
-              </w:rPr>
               <w:fldChar w:fldCharType="begin"/>
-            </w:r>
-            <w:r>
-              <w:rPr>
-                <w:noProof/>
-                <w:webHidden/>
-              </w:rPr>
               <w:instrText xml:space="preserve"> PAGEREF _Toc240406078 \h </w:instrText>
-            </w:r>
-            <w:r>
-              <w:rPr>
-                <w:noProof/>
-                <w:webHidden/>
-              </w:rPr>
-            </w:r>
-            <w:r>
-              <w:rPr>
-                <w:noProof/>
-                <w:webHidden/>
-              </w:rPr>
               <w:fldChar w:fldCharType="separate"/>
-            </w:r>
-            <w:r>
-              <w:rPr>
-                <w:noProof/>
-                <w:webHidden/>
-              </w:rPr>
               <w:t>13</w:t>
-            </w:r>
-            <w:r>
-              <w:rPr>
-                <w:noProof/>
-                <w:webHidden/>
-              </w:rPr>
               <w:fldChar w:fldCharType="end"/>
             </w:r>
           </w:hyperlink>
@@ -1708,46 +1085,10 @@
                 <w:webHidden/>
               </w:rPr>
               <w:tab/>
-            </w:r>
-            <w:r>
-              <w:rPr>
-                <w:noProof/>
-                <w:webHidden/>
-              </w:rPr>
               <w:fldChar w:fldCharType="begin"/>
-            </w:r>
-            <w:r>
-              <w:rPr>
-                <w:noProof/>
-                <w:webHidden/>
-              </w:rPr>
               <w:instrText xml:space="preserve"> PAGEREF _Toc240406079 \h </w:instrText>
-            </w:r>
-            <w:r>
-              <w:rPr>
-                <w:noProof/>
-                <w:webHidden/>
-              </w:rPr>
-            </w:r>
-            <w:r>
-              <w:rPr>
-                <w:noProof/>
-                <w:webHidden/>
-              </w:rPr>
               <w:fldChar w:fldCharType="separate"/>
-            </w:r>
-            <w:r>
-              <w:rPr>
-                <w:noProof/>
-                <w:webHidden/>
-              </w:rPr>
               <w:t>13</w:t>
-            </w:r>
-            <w:r>
-              <w:rPr>
-                <w:noProof/>
-                <w:webHidden/>
-              </w:rPr>
               <w:fldChar w:fldCharType="end"/>
             </w:r>
           </w:hyperlink>
@@ -1799,46 +1140,10 @@
                 <w:webHidden/>
               </w:rPr>
               <w:tab/>
-            </w:r>
-            <w:r>
-              <w:rPr>
-                <w:noProof/>
-                <w:webHidden/>
-              </w:rPr>
               <w:fldChar w:fldCharType="begin"/>
-            </w:r>
-            <w:r>
-              <w:rPr>
-                <w:noProof/>
-                <w:webHidden/>
-              </w:rPr>
               <w:instrText xml:space="preserve"> PAGEREF _Toc240406080 \h </w:instrText>
-            </w:r>
-            <w:r>
-              <w:rPr>
-                <w:noProof/>
-                <w:webHidden/>
-              </w:rPr>
-            </w:r>
-            <w:r>
-              <w:rPr>
-                <w:noProof/>
-                <w:webHidden/>
-              </w:rPr>
               <w:fldChar w:fldCharType="separate"/>
-            </w:r>
-            <w:r>
-              <w:rPr>
-                <w:noProof/>
-                <w:webHidden/>
-              </w:rPr>
               <w:t>14</w:t>
-            </w:r>
-            <w:r>
-              <w:rPr>
-                <w:noProof/>
-                <w:webHidden/>
-              </w:rPr>
               <w:fldChar w:fldCharType="end"/>
             </w:r>
           </w:hyperlink>
@@ -1886,46 +1191,10 @@
                 <w:webHidden/>
               </w:rPr>
               <w:tab/>
-            </w:r>
-            <w:r>
-              <w:rPr>
-                <w:noProof/>
-                <w:webHidden/>
-              </w:rPr>
               <w:fldChar w:fldCharType="begin"/>
-            </w:r>
-            <w:r>
-              <w:rPr>
-                <w:noProof/>
-                <w:webHidden/>
-              </w:rPr>
               <w:instrText xml:space="preserve"> PAGEREF _Toc240406081 \h </w:instrText>
-            </w:r>
-            <w:r>
-              <w:rPr>
-                <w:noProof/>
-                <w:webHidden/>
-              </w:rPr>
-            </w:r>
-            <w:r>
-              <w:rPr>
-                <w:noProof/>
-                <w:webHidden/>
-              </w:rPr>
               <w:fldChar w:fldCharType="separate"/>
-            </w:r>
-            <w:r>
-              <w:rPr>
-                <w:noProof/>
-                <w:webHidden/>
-              </w:rPr>
               <w:t>14</w:t>
-            </w:r>
-            <w:r>
-              <w:rPr>
-                <w:noProof/>
-                <w:webHidden/>
-              </w:rPr>
               <w:fldChar w:fldCharType="end"/>
             </w:r>
           </w:hyperlink>
@@ -1973,46 +1242,10 @@
                 <w:webHidden/>
               </w:rPr>
               <w:tab/>
-            </w:r>
-            <w:r>
-              <w:rPr>
-                <w:noProof/>
-                <w:webHidden/>
-              </w:rPr>
               <w:fldChar w:fldCharType="begin"/>
-            </w:r>
-            <w:r>
-              <w:rPr>
-                <w:noProof/>
-                <w:webHidden/>
-              </w:rPr>
               <w:instrText xml:space="preserve"> PAGEREF _Toc240406082 \h </w:instrText>
-            </w:r>
-            <w:r>
-              <w:rPr>
-                <w:noProof/>
-                <w:webHidden/>
-              </w:rPr>
-            </w:r>
-            <w:r>
-              <w:rPr>
-                <w:noProof/>
-                <w:webHidden/>
-              </w:rPr>
               <w:fldChar w:fldCharType="separate"/>
-            </w:r>
-            <w:r>
-              <w:rPr>
-                <w:noProof/>
-                <w:webHidden/>
-              </w:rPr>
               <w:t>14</w:t>
-            </w:r>
-            <w:r>
-              <w:rPr>
-                <w:noProof/>
-                <w:webHidden/>
-              </w:rPr>
               <w:fldChar w:fldCharType="end"/>
             </w:r>
           </w:hyperlink>
@@ -2060,46 +1293,10 @@
                 <w:webHidden/>
               </w:rPr>
               <w:tab/>
-            </w:r>
-            <w:r>
-              <w:rPr>
-                <w:noProof/>
-                <w:webHidden/>
-              </w:rPr>
               <w:fldChar w:fldCharType="begin"/>
-            </w:r>
-            <w:r>
-              <w:rPr>
-                <w:noProof/>
-                <w:webHidden/>
-              </w:rPr>
               <w:instrText xml:space="preserve"> PAGEREF _Toc240406083 \h </w:instrText>
-            </w:r>
-            <w:r>
-              <w:rPr>
-                <w:noProof/>
-                <w:webHidden/>
-              </w:rPr>
-            </w:r>
-            <w:r>
-              <w:rPr>
-                <w:noProof/>
-                <w:webHidden/>
-              </w:rPr>
               <w:fldChar w:fldCharType="separate"/>
-            </w:r>
-            <w:r>
-              <w:rPr>
-                <w:noProof/>
-                <w:webHidden/>
-              </w:rPr>
               <w:t>14</w:t>
-            </w:r>
-            <w:r>
-              <w:rPr>
-                <w:noProof/>
-                <w:webHidden/>
-              </w:rPr>
               <w:fldChar w:fldCharType="end"/>
             </w:r>
           </w:hyperlink>
@@ -2147,46 +1344,10 @@
                 <w:webHidden/>
               </w:rPr>
               <w:tab/>
-            </w:r>
-            <w:r>
-              <w:rPr>
-                <w:noProof/>
-                <w:webHidden/>
-              </w:rPr>
               <w:fldChar w:fldCharType="begin"/>
-            </w:r>
-            <w:r>
-              <w:rPr>
-                <w:noProof/>
-                <w:webHidden/>
-              </w:rPr>
               <w:instrText xml:space="preserve"> PAGEREF _Toc240406084 \h </w:instrText>
-            </w:r>
-            <w:r>
-              <w:rPr>
-                <w:noProof/>
-                <w:webHidden/>
-              </w:rPr>
-            </w:r>
-            <w:r>
-              <w:rPr>
-                <w:noProof/>
-                <w:webHidden/>
-              </w:rPr>
               <w:fldChar w:fldCharType="separate"/>
-            </w:r>
-            <w:r>
-              <w:rPr>
-                <w:noProof/>
-                <w:webHidden/>
-              </w:rPr>
               <w:t>14</w:t>
-            </w:r>
-            <w:r>
-              <w:rPr>
-                <w:noProof/>
-                <w:webHidden/>
-              </w:rPr>
               <w:fldChar w:fldCharType="end"/>
             </w:r>
           </w:hyperlink>
@@ -2234,46 +1395,10 @@
                 <w:webHidden/>
               </w:rPr>
               <w:tab/>
-            </w:r>
-            <w:r>
-              <w:rPr>
-                <w:noProof/>
-                <w:webHidden/>
-              </w:rPr>
               <w:fldChar w:fldCharType="begin"/>
-            </w:r>
-            <w:r>
-              <w:rPr>
-                <w:noProof/>
-                <w:webHidden/>
-              </w:rPr>
               <w:instrText xml:space="preserve"> PAGEREF _Toc240406085 \h </w:instrText>
-            </w:r>
-            <w:r>
-              <w:rPr>
-                <w:noProof/>
-                <w:webHidden/>
-              </w:rPr>
-            </w:r>
-            <w:r>
-              <w:rPr>
-                <w:noProof/>
-                <w:webHidden/>
-              </w:rPr>
               <w:fldChar w:fldCharType="separate"/>
-            </w:r>
-            <w:r>
-              <w:rPr>
-                <w:noProof/>
-                <w:webHidden/>
-              </w:rPr>
               <w:t>14</w:t>
-            </w:r>
-            <w:r>
-              <w:rPr>
-                <w:noProof/>
-                <w:webHidden/>
-              </w:rPr>
               <w:fldChar w:fldCharType="end"/>
             </w:r>
           </w:hyperlink>
@@ -2325,46 +1450,10 @@
                 <w:webHidden/>
               </w:rPr>
               <w:tab/>
-            </w:r>
-            <w:r>
-              <w:rPr>
-                <w:noProof/>
-                <w:webHidden/>
-              </w:rPr>
               <w:fldChar w:fldCharType="begin"/>
-            </w:r>
-            <w:r>
-              <w:rPr>
-                <w:noProof/>
-                <w:webHidden/>
-              </w:rPr>
               <w:instrText xml:space="preserve"> PAGEREF _Toc240406086 \h </w:instrText>
-            </w:r>
-            <w:r>
-              <w:rPr>
-                <w:noProof/>
-                <w:webHidden/>
-              </w:rPr>
-            </w:r>
-            <w:r>
-              <w:rPr>
-                <w:noProof/>
-                <w:webHidden/>
-              </w:rPr>
               <w:fldChar w:fldCharType="separate"/>
-            </w:r>
-            <w:r>
-              <w:rPr>
-                <w:noProof/>
-                <w:webHidden/>
-              </w:rPr>
               <w:t>14</w:t>
-            </w:r>
-            <w:r>
-              <w:rPr>
-                <w:noProof/>
-                <w:webHidden/>
-              </w:rPr>
               <w:fldChar w:fldCharType="end"/>
             </w:r>
           </w:hyperlink>
@@ -2416,46 +1505,10 @@
                 <w:webHidden/>
               </w:rPr>
               <w:tab/>
-            </w:r>
-            <w:r>
-              <w:rPr>
-                <w:noProof/>
-                <w:webHidden/>
-              </w:rPr>
               <w:fldChar w:fldCharType="begin"/>
-            </w:r>
-            <w:r>
-              <w:rPr>
-                <w:noProof/>
-                <w:webHidden/>
-              </w:rPr>
               <w:instrText xml:space="preserve"> PAGEREF _Toc240406087 \h </w:instrText>
-            </w:r>
-            <w:r>
-              <w:rPr>
-                <w:noProof/>
-                <w:webHidden/>
-              </w:rPr>
-            </w:r>
-            <w:r>
-              <w:rPr>
-                <w:noProof/>
-                <w:webHidden/>
-              </w:rPr>
               <w:fldChar w:fldCharType="separate"/>
-            </w:r>
-            <w:r>
-              <w:rPr>
-                <w:noProof/>
-                <w:webHidden/>
-              </w:rPr>
               <w:t>15</w:t>
-            </w:r>
-            <w:r>
-              <w:rPr>
-                <w:noProof/>
-                <w:webHidden/>
-              </w:rPr>
               <w:fldChar w:fldCharType="end"/>
             </w:r>
           </w:hyperlink>
@@ -2507,46 +1560,10 @@
                 <w:webHidden/>
               </w:rPr>
               <w:tab/>
-            </w:r>
-            <w:r>
-              <w:rPr>
-                <w:noProof/>
-                <w:webHidden/>
-              </w:rPr>
               <w:fldChar w:fldCharType="begin"/>
-            </w:r>
-            <w:r>
-              <w:rPr>
-                <w:noProof/>
-                <w:webHidden/>
-              </w:rPr>
               <w:instrText xml:space="preserve"> PAGEREF _Toc240406088 \h </w:instrText>
-            </w:r>
-            <w:r>
-              <w:rPr>
-                <w:noProof/>
-                <w:webHidden/>
-              </w:rPr>
-            </w:r>
-            <w:r>
-              <w:rPr>
-                <w:noProof/>
-                <w:webHidden/>
-              </w:rPr>
               <w:fldChar w:fldCharType="separate"/>
-            </w:r>
-            <w:r>
-              <w:rPr>
-                <w:noProof/>
-                <w:webHidden/>
-              </w:rPr>
               <w:t>15</w:t>
-            </w:r>
-            <w:r>
-              <w:rPr>
-                <w:noProof/>
-                <w:webHidden/>
-              </w:rPr>
               <w:fldChar w:fldCharType="end"/>
             </w:r>
           </w:hyperlink>
@@ -2598,46 +1615,10 @@
                 <w:webHidden/>
               </w:rPr>
               <w:tab/>
-            </w:r>
-            <w:r>
-              <w:rPr>
-                <w:noProof/>
-                <w:webHidden/>
-              </w:rPr>
               <w:fldChar w:fldCharType="begin"/>
-            </w:r>
-            <w:r>
-              <w:rPr>
-                <w:noProof/>
-                <w:webHidden/>
-              </w:rPr>
               <w:instrText xml:space="preserve"> PAGEREF _Toc240406089 \h </w:instrText>
-            </w:r>
-            <w:r>
-              <w:rPr>
-                <w:noProof/>
-                <w:webHidden/>
-              </w:rPr>
-            </w:r>
-            <w:r>
-              <w:rPr>
-                <w:noProof/>
-                <w:webHidden/>
-              </w:rPr>
               <w:fldChar w:fldCharType="separate"/>
-            </w:r>
-            <w:r>
-              <w:rPr>
-                <w:noProof/>
-                <w:webHidden/>
-              </w:rPr>
               <w:t>15</w:t>
-            </w:r>
-            <w:r>
-              <w:rPr>
-                <w:noProof/>
-                <w:webHidden/>
-              </w:rPr>
               <w:fldChar w:fldCharType="end"/>
             </w:r>
           </w:hyperlink>
@@ -2689,46 +1670,10 @@
                 <w:webHidden/>
               </w:rPr>
               <w:tab/>
-            </w:r>
-            <w:r>
-              <w:rPr>
-                <w:noProof/>
-                <w:webHidden/>
-              </w:rPr>
               <w:fldChar w:fldCharType="begin"/>
-            </w:r>
-            <w:r>
-              <w:rPr>
-                <w:noProof/>
-                <w:webHidden/>
-              </w:rPr>
               <w:instrText xml:space="preserve"> PAGEREF _Toc240406090 \h </w:instrText>
-            </w:r>
-            <w:r>
-              <w:rPr>
-                <w:noProof/>
-                <w:webHidden/>
-              </w:rPr>
-            </w:r>
-            <w:r>
-              <w:rPr>
-                <w:noProof/>
-                <w:webHidden/>
-              </w:rPr>
               <w:fldChar w:fldCharType="separate"/>
-            </w:r>
-            <w:r>
-              <w:rPr>
-                <w:noProof/>
-                <w:webHidden/>
-              </w:rPr>
               <w:t>16</w:t>
-            </w:r>
-            <w:r>
-              <w:rPr>
-                <w:noProof/>
-                <w:webHidden/>
-              </w:rPr>
               <w:fldChar w:fldCharType="end"/>
             </w:r>
           </w:hyperlink>
@@ -2780,46 +1725,10 @@
                 <w:webHidden/>
               </w:rPr>
               <w:tab/>
-            </w:r>
-            <w:r>
-              <w:rPr>
-                <w:noProof/>
-                <w:webHidden/>
-              </w:rPr>
               <w:fldChar w:fldCharType="begin"/>
-            </w:r>
-            <w:r>
-              <w:rPr>
-                <w:noProof/>
-                <w:webHidden/>
-              </w:rPr>
               <w:instrText xml:space="preserve"> PAGEREF _Toc240406091 \h </w:instrText>
-            </w:r>
-            <w:r>
-              <w:rPr>
-                <w:noProof/>
-                <w:webHidden/>
-              </w:rPr>
-            </w:r>
-            <w:r>
-              <w:rPr>
-                <w:noProof/>
-                <w:webHidden/>
-              </w:rPr>
               <w:fldChar w:fldCharType="separate"/>
-            </w:r>
-            <w:r>
-              <w:rPr>
-                <w:noProof/>
-                <w:webHidden/>
-              </w:rPr>
               <w:t>16</w:t>
-            </w:r>
-            <w:r>
-              <w:rPr>
-                <w:noProof/>
-                <w:webHidden/>
-              </w:rPr>
               <w:fldChar w:fldCharType="end"/>
             </w:r>
           </w:hyperlink>
@@ -2871,46 +1780,10 @@
                 <w:webHidden/>
               </w:rPr>
               <w:tab/>
-            </w:r>
-            <w:r>
-              <w:rPr>
-                <w:noProof/>
-                <w:webHidden/>
-              </w:rPr>
               <w:fldChar w:fldCharType="begin"/>
-            </w:r>
-            <w:r>
-              <w:rPr>
-                <w:noProof/>
-                <w:webHidden/>
-              </w:rPr>
               <w:instrText xml:space="preserve"> PAGEREF _Toc240406092 \h </w:instrText>
-            </w:r>
-            <w:r>
-              <w:rPr>
-                <w:noProof/>
-                <w:webHidden/>
-              </w:rPr>
-            </w:r>
-            <w:r>
-              <w:rPr>
-                <w:noProof/>
-                <w:webHidden/>
-              </w:rPr>
               <w:fldChar w:fldCharType="separate"/>
-            </w:r>
-            <w:r>
-              <w:rPr>
-                <w:noProof/>
-                <w:webHidden/>
-              </w:rPr>
               <w:t>16</w:t>
-            </w:r>
-            <w:r>
-              <w:rPr>
-                <w:noProof/>
-                <w:webHidden/>
-              </w:rPr>
               <w:fldChar w:fldCharType="end"/>
             </w:r>
           </w:hyperlink>
@@ -2962,46 +1835,10 @@
                 <w:webHidden/>
               </w:rPr>
               <w:tab/>
-            </w:r>
-            <w:r>
-              <w:rPr>
-                <w:noProof/>
-                <w:webHidden/>
-              </w:rPr>
               <w:fldChar w:fldCharType="begin"/>
-            </w:r>
-            <w:r>
-              <w:rPr>
-                <w:noProof/>
-                <w:webHidden/>
-              </w:rPr>
               <w:instrText xml:space="preserve"> PAGEREF _Toc240406093 \h </w:instrText>
-            </w:r>
-            <w:r>
-              <w:rPr>
-                <w:noProof/>
-                <w:webHidden/>
-              </w:rPr>
-            </w:r>
-            <w:r>
-              <w:rPr>
-                <w:noProof/>
-                <w:webHidden/>
-              </w:rPr>
               <w:fldChar w:fldCharType="separate"/>
-            </w:r>
-            <w:r>
-              <w:rPr>
-                <w:noProof/>
-                <w:webHidden/>
-              </w:rPr>
               <w:t>17</w:t>
-            </w:r>
-            <w:r>
-              <w:rPr>
-                <w:noProof/>
-                <w:webHidden/>
-              </w:rPr>
               <w:fldChar w:fldCharType="end"/>
             </w:r>
           </w:hyperlink>
@@ -3053,46 +1890,10 @@
                 <w:webHidden/>
               </w:rPr>
               <w:tab/>
-            </w:r>
-            <w:r>
-              <w:rPr>
-                <w:noProof/>
-                <w:webHidden/>
-              </w:rPr>
               <w:fldChar w:fldCharType="begin"/>
-            </w:r>
-            <w:r>
-              <w:rPr>
-                <w:noProof/>
-                <w:webHidden/>
-              </w:rPr>
               <w:instrText xml:space="preserve"> PAGEREF _Toc240406094 \h </w:instrText>
-            </w:r>
-            <w:r>
-              <w:rPr>
-                <w:noProof/>
-                <w:webHidden/>
-              </w:rPr>
-            </w:r>
-            <w:r>
-              <w:rPr>
-                <w:noProof/>
-                <w:webHidden/>
-              </w:rPr>
               <w:fldChar w:fldCharType="separate"/>
-            </w:r>
-            <w:r>
-              <w:rPr>
-                <w:noProof/>
-                <w:webHidden/>
-              </w:rPr>
               <w:t>17</w:t>
-            </w:r>
-            <w:r>
-              <w:rPr>
-                <w:noProof/>
-                <w:webHidden/>
-              </w:rPr>
               <w:fldChar w:fldCharType="end"/>
             </w:r>
           </w:hyperlink>
@@ -3144,46 +1945,10 @@
                 <w:webHidden/>
               </w:rPr>
               <w:tab/>
-            </w:r>
-            <w:r>
-              <w:rPr>
-                <w:noProof/>
-                <w:webHidden/>
-              </w:rPr>
               <w:fldChar w:fldCharType="begin"/>
-            </w:r>
-            <w:r>
-              <w:rPr>
-                <w:noProof/>
-                <w:webHidden/>
-              </w:rPr>
               <w:instrText xml:space="preserve"> PAGEREF _Toc240406095 \h </w:instrText>
-            </w:r>
-            <w:r>
-              <w:rPr>
-                <w:noProof/>
-                <w:webHidden/>
-              </w:rPr>
-            </w:r>
-            <w:r>
-              <w:rPr>
-                <w:noProof/>
-                <w:webHidden/>
-              </w:rPr>
               <w:fldChar w:fldCharType="separate"/>
-            </w:r>
-            <w:r>
-              <w:rPr>
-                <w:noProof/>
-                <w:webHidden/>
-              </w:rPr>
               <w:t>17</w:t>
-            </w:r>
-            <w:r>
-              <w:rPr>
-                <w:noProof/>
-                <w:webHidden/>
-              </w:rPr>
               <w:fldChar w:fldCharType="end"/>
             </w:r>
           </w:hyperlink>
@@ -3235,46 +2000,10 @@
                 <w:webHidden/>
               </w:rPr>
               <w:tab/>
-            </w:r>
-            <w:r>
-              <w:rPr>
-                <w:noProof/>
-                <w:webHidden/>
-              </w:rPr>
               <w:fldChar w:fldCharType="begin"/>
-            </w:r>
-            <w:r>
-              <w:rPr>
-                <w:noProof/>
-                <w:webHidden/>
-              </w:rPr>
               <w:instrText xml:space="preserve"> PAGEREF _Toc240406096 \h </w:instrText>
-            </w:r>
-            <w:r>
-              <w:rPr>
-                <w:noProof/>
-                <w:webHidden/>
-              </w:rPr>
-            </w:r>
-            <w:r>
-              <w:rPr>
-                <w:noProof/>
-                <w:webHidden/>
-              </w:rPr>
               <w:fldChar w:fldCharType="separate"/>
-            </w:r>
-            <w:r>
-              <w:rPr>
-                <w:noProof/>
-                <w:webHidden/>
-              </w:rPr>
               <w:t>18</w:t>
-            </w:r>
-            <w:r>
-              <w:rPr>
-                <w:noProof/>
-                <w:webHidden/>
-              </w:rPr>
               <w:fldChar w:fldCharType="end"/>
             </w:r>
           </w:hyperlink>
@@ -3326,46 +2055,10 @@
                 <w:webHidden/>
               </w:rPr>
               <w:tab/>
-            </w:r>
-            <w:r>
-              <w:rPr>
-                <w:noProof/>
-                <w:webHidden/>
-              </w:rPr>
               <w:fldChar w:fldCharType="begin"/>
-            </w:r>
-            <w:r>
-              <w:rPr>
-                <w:noProof/>
-                <w:webHidden/>
-              </w:rPr>
               <w:instrText xml:space="preserve"> PAGEREF _Toc240406097 \h </w:instrText>
-            </w:r>
-            <w:r>
-              <w:rPr>
-                <w:noProof/>
-                <w:webHidden/>
-              </w:rPr>
-            </w:r>
-            <w:r>
-              <w:rPr>
-                <w:noProof/>
-                <w:webHidden/>
-              </w:rPr>
               <w:fldChar w:fldCharType="separate"/>
-            </w:r>
-            <w:r>
-              <w:rPr>
-                <w:noProof/>
-                <w:webHidden/>
-              </w:rPr>
               <w:t>18</w:t>
-            </w:r>
-            <w:r>
-              <w:rPr>
-                <w:noProof/>
-                <w:webHidden/>
-              </w:rPr>
               <w:fldChar w:fldCharType="end"/>
             </w:r>
           </w:hyperlink>
@@ -3417,46 +2110,10 @@
                 <w:webHidden/>
               </w:rPr>
               <w:tab/>
-            </w:r>
-            <w:r>
-              <w:rPr>
-                <w:noProof/>
-                <w:webHidden/>
-              </w:rPr>
               <w:fldChar w:fldCharType="begin"/>
-            </w:r>
-            <w:r>
-              <w:rPr>
-                <w:noProof/>
-                <w:webHidden/>
-              </w:rPr>
               <w:instrText xml:space="preserve"> PAGEREF _Toc240406098 \h </w:instrText>
-            </w:r>
-            <w:r>
-              <w:rPr>
-                <w:noProof/>
-                <w:webHidden/>
-              </w:rPr>
-            </w:r>
-            <w:r>
-              <w:rPr>
-                <w:noProof/>
-                <w:webHidden/>
-              </w:rPr>
               <w:fldChar w:fldCharType="separate"/>
-            </w:r>
-            <w:r>
-              <w:rPr>
-                <w:noProof/>
-                <w:webHidden/>
-              </w:rPr>
               <w:t>18</w:t>
-            </w:r>
-            <w:r>
-              <w:rPr>
-                <w:noProof/>
-                <w:webHidden/>
-              </w:rPr>
               <w:fldChar w:fldCharType="end"/>
             </w:r>
           </w:hyperlink>
@@ -3511,46 +2168,10 @@
                 <w:webHidden/>
               </w:rPr>
               <w:tab/>
-            </w:r>
-            <w:r>
-              <w:rPr>
-                <w:noProof/>
-                <w:webHidden/>
-              </w:rPr>
               <w:fldChar w:fldCharType="begin"/>
-            </w:r>
-            <w:r>
-              <w:rPr>
-                <w:noProof/>
-                <w:webHidden/>
-              </w:rPr>
               <w:instrText xml:space="preserve"> PAGEREF _Toc240406099 \h </w:instrText>
-            </w:r>
-            <w:r>
-              <w:rPr>
-                <w:noProof/>
-                <w:webHidden/>
-              </w:rPr>
-            </w:r>
-            <w:r>
-              <w:rPr>
-                <w:noProof/>
-                <w:webHidden/>
-              </w:rPr>
               <w:fldChar w:fldCharType="separate"/>
-            </w:r>
-            <w:r>
-              <w:rPr>
-                <w:noProof/>
-                <w:webHidden/>
-              </w:rPr>
               <w:t>19</w:t>
-            </w:r>
-            <w:r>
-              <w:rPr>
-                <w:noProof/>
-                <w:webHidden/>
-              </w:rPr>
               <w:fldChar w:fldCharType="end"/>
             </w:r>
           </w:hyperlink>
@@ -3602,46 +2223,10 @@
                 <w:webHidden/>
               </w:rPr>
               <w:tab/>
-            </w:r>
-            <w:r>
-              <w:rPr>
-                <w:noProof/>
-                <w:webHidden/>
-              </w:rPr>
               <w:fldChar w:fldCharType="begin"/>
-            </w:r>
-            <w:r>
-              <w:rPr>
-                <w:noProof/>
-                <w:webHidden/>
-              </w:rPr>
               <w:instrText xml:space="preserve"> PAGEREF _Toc240406100 \h </w:instrText>
-            </w:r>
-            <w:r>
-              <w:rPr>
-                <w:noProof/>
-                <w:webHidden/>
-              </w:rPr>
-            </w:r>
-            <w:r>
-              <w:rPr>
-                <w:noProof/>
-                <w:webHidden/>
-              </w:rPr>
               <w:fldChar w:fldCharType="separate"/>
-            </w:r>
-            <w:r>
-              <w:rPr>
-                <w:noProof/>
-                <w:webHidden/>
-              </w:rPr>
               <w:t>19</w:t>
-            </w:r>
-            <w:r>
-              <w:rPr>
-                <w:noProof/>
-                <w:webHidden/>
-              </w:rPr>
               <w:fldChar w:fldCharType="end"/>
             </w:r>
           </w:hyperlink>
@@ -3693,46 +2278,10 @@
                 <w:webHidden/>
               </w:rPr>
               <w:tab/>
-            </w:r>
-            <w:r>
-              <w:rPr>
-                <w:noProof/>
-                <w:webHidden/>
-              </w:rPr>
               <w:fldChar w:fldCharType="begin"/>
-            </w:r>
-            <w:r>
-              <w:rPr>
-                <w:noProof/>
-                <w:webHidden/>
-              </w:rPr>
               <w:instrText xml:space="preserve"> PAGEREF _Toc240406101 \h </w:instrText>
-            </w:r>
-            <w:r>
-              <w:rPr>
-                <w:noProof/>
-                <w:webHidden/>
-              </w:rPr>
-            </w:r>
-            <w:r>
-              <w:rPr>
-                <w:noProof/>
-                <w:webHidden/>
-              </w:rPr>
               <w:fldChar w:fldCharType="separate"/>
-            </w:r>
-            <w:r>
-              <w:rPr>
-                <w:noProof/>
-                <w:webHidden/>
-              </w:rPr>
               <w:t>19</w:t>
-            </w:r>
-            <w:r>
-              <w:rPr>
-                <w:noProof/>
-                <w:webHidden/>
-              </w:rPr>
               <w:fldChar w:fldCharType="end"/>
             </w:r>
           </w:hyperlink>
@@ -3784,46 +2333,10 @@
                 <w:webHidden/>
               </w:rPr>
               <w:tab/>
-            </w:r>
-            <w:r>
-              <w:rPr>
-                <w:noProof/>
-                <w:webHidden/>
-              </w:rPr>
               <w:fldChar w:fldCharType="begin"/>
-            </w:r>
-            <w:r>
-              <w:rPr>
-                <w:noProof/>
-                <w:webHidden/>
-              </w:rPr>
               <w:instrText xml:space="preserve"> PAGEREF _Toc240406102 \h </w:instrText>
-            </w:r>
-            <w:r>
-              <w:rPr>
-                <w:noProof/>
-                <w:webHidden/>
-              </w:rPr>
-            </w:r>
-            <w:r>
-              <w:rPr>
-                <w:noProof/>
-                <w:webHidden/>
-              </w:rPr>
               <w:fldChar w:fldCharType="separate"/>
-            </w:r>
-            <w:r>
-              <w:rPr>
-                <w:noProof/>
-                <w:webHidden/>
-              </w:rPr>
               <w:t>20</w:t>
-            </w:r>
-            <w:r>
-              <w:rPr>
-                <w:noProof/>
-                <w:webHidden/>
-              </w:rPr>
               <w:fldChar w:fldCharType="end"/>
             </w:r>
           </w:hyperlink>
@@ -4026,6 +2539,48 @@
           <w:p>
             <w:r>
               <w:t>Initial version</w:t>
+            </w:r>
+          </w:p>
+        </w:tc>
+      </w:tr>
+      <w:tr>
+        <w:tc>
+          <w:tcPr>
+            <w:tcW w:w="1098" w:type="dxa"/>
+          </w:tcPr>
+          <w:p>
+            <w:r>
+              <w:t>1.1</w:t>
+            </w:r>
+          </w:p>
+        </w:tc>
+        <w:tc>
+          <w:tcPr>
+            <w:tcW w:w="1440" w:type="dxa"/>
+          </w:tcPr>
+          <w:p>
+            <w:r>
+              <w:t>28/09/2026</w:t>
+            </w:r>
+          </w:p>
+        </w:tc>
+        <w:tc>
+          <w:tcPr>
+            <w:tcW w:w="1980" w:type="dxa"/>
+          </w:tcPr>
+          <w:p>
+            <w:r>
+              <w:t>Nghia VT</w:t>
+            </w:r>
+          </w:p>
+        </w:tc>
+        <w:tc>
+          <w:tcPr>
+            <w:tcW w:w="5922" w:type="dxa"/>
+          </w:tcPr>
+          <w:p>
+            <w:r>
+              <w:t>2.1 and 4.3: a wrapper is m_qnsc_wrap_&lt;ip&gt;, the IP's short name in the chip contract (m_qnsc_wrap_uart, m_qnsc_wrap_isram), not the vendor module name</w:t>
             </w:r>
           </w:p>
         </w:tc>
@@ -6366,7 +4921,7 @@
         <w:rPr>
           <w:rStyle w:val="HTMLCode"/>
         </w:rPr>
-        <w:t>m_qnsc_wrap_&lt;ip_module&gt;</w:t>
+        <w:t>m_qnsc_wrap_&lt;ip&gt;</w:t>
       </w:r>
     </w:p>
     <w:p>
@@ -6374,6 +4929,23 @@
         <w:pStyle w:val="NormalWeb"/>
       </w:pPr>
       <w:r>
+        <w:t xml:space="preserve">where </w:t>
+      </w:r>
+      <w:r>
+        <w:rPr>
+          <w:rStyle w:val="HTMLCode"/>
+        </w:rPr>
+        <w:t>&lt;ip&gt;</w:t>
+      </w:r>
+      <w:r>
+        <w:t xml:space="preserve"> is the short name of the IP as the chip contract names it, without an index, not the name of the vendor module. The name stays the same when the IP is replaced. Two configurations of one IP are two IPs in the contract, each with its own wrapper.</w:t>
+      </w:r>
+    </w:p>
+    <w:p>
+      <w:pPr>
+        <w:pStyle w:val="NormalWeb"/>
+      </w:pPr>
+      <w:r>
         <w:t>Examples:</w:t>
       </w:r>
     </w:p>
@@ -6388,21 +4960,21 @@
         <w:rPr>
           <w:rStyle w:val="HTMLCode"/>
         </w:rPr>
-        <w:t>m_qnsc_wrap_ibex</w:t>
-      </w:r>
-    </w:p>
-    <w:p>
-      <w:pPr>
-        <w:pStyle w:val="HTMLPreformatted"/>
-        <w:rPr>
-          <w:rStyle w:val="HTMLCode"/>
-        </w:rPr>
-      </w:pPr>
-      <w:r>
-        <w:rPr>
-          <w:rStyle w:val="HTMLCode"/>
-        </w:rPr>
-        <w:t>m_qnsc_wrap_apb_uart</w:t>
+        <w:t>m_qnsc_wrap_cpu</w:t>
+      </w:r>
+    </w:p>
+    <w:p>
+      <w:pPr>
+        <w:pStyle w:val="HTMLPreformatted"/>
+        <w:rPr>
+          <w:rStyle w:val="HTMLCode"/>
+        </w:rPr>
+      </w:pPr>
+      <w:r>
+        <w:rPr>
+          <w:rStyle w:val="HTMLCode"/>
+        </w:rPr>
+        <w:t>m_qnsc_wrap_uart</w:t>
       </w:r>
     </w:p>
     <w:p>
@@ -6414,6 +4986,28 @@
           <w:rStyle w:val="HTMLCode"/>
         </w:rPr>
         <w:t>m_qnsc_wrap_timer</w:t>
+      </w:r>
+    </w:p>
+    <w:p>
+      <w:pPr>
+        <w:pStyle w:val="HTMLPreformatted"/>
+      </w:pPr>
+      <w:r>
+        <w:rPr>
+          <w:rStyle w:val="HTMLCode"/>
+        </w:rPr>
+        <w:t>m_qnsc_wrap_isram</w:t>
+      </w:r>
+    </w:p>
+    <w:p>
+      <w:pPr>
+        <w:pStyle w:val="HTMLPreformatted"/>
+      </w:pPr>
+      <w:r>
+        <w:rPr>
+          <w:rStyle w:val="HTMLCode"/>
+        </w:rPr>
+        <w:t>m_qnsc_wrap_dsram</w:t>
       </w:r>
     </w:p>
     <w:p>
@@ -7005,25 +5599,7 @@
         <w:rPr>
           <w:rStyle w:val="HTMLCode"/>
         </w:rPr>
-        <w:t>P</w:t>
-      </w:r>
-      <w:r>
-        <w:rPr>
-          <w:rStyle w:val="HTMLCode"/>
-        </w:rPr>
-        <w:t>_&lt;</w:t>
-      </w:r>
-      <w:r>
-        <w:rPr>
-          <w:rStyle w:val="HTMLCode"/>
-        </w:rPr>
-        <w:t>FUNCTION</w:t>
-      </w:r>
-      <w:r>
-        <w:rPr>
-          <w:rStyle w:val="HTMLCode"/>
-        </w:rPr>
-        <w:t>&gt;</w:t>
+        <w:t>P_&lt;FUNCTION&gt;</w:t>
       </w:r>
     </w:p>
     <w:p>
@@ -8806,13 +7382,7 @@
           <w:rStyle w:val="HTMLCode"/>
         </w:rPr>
         <w:lastRenderedPageBreak/>
-        <w:t>i_pad</w:t>
-      </w:r>
-      <w:r>
-        <w:rPr>
-          <w:rStyle w:val="HTMLCode"/>
-        </w:rPr>
-        <w:t>_</w:t>
+        <w:t>i_pad_</w:t>
       </w:r>
       <w:r>
         <w:rPr>
@@ -11503,13 +10073,7 @@
         <w:rPr>
           <w:rStyle w:val="HTMLCode"/>
         </w:rPr>
-        <w:t xml:space="preserve">    </w:t>
-      </w:r>
-      <w:r>
-        <w:rPr>
-          <w:rStyle w:val="HTMLCode"/>
-        </w:rPr>
-        <w:t>P_DATA_WIDTH</w:t>
+        <w:t xml:space="preserve">    P_DATA_WIDTH</w:t>
       </w:r>
     </w:p>
     <w:p>
@@ -11545,13 +10109,7 @@
         <w:rPr>
           <w:rStyle w:val="HTMLCode"/>
         </w:rPr>
-        <w:t xml:space="preserve">    </w:t>
-      </w:r>
-      <w:r>
-        <w:rPr>
-          <w:rStyle w:val="HTMLCode"/>
-        </w:rPr>
-        <w:t>C_IDLE</w:t>
+        <w:t xml:space="preserve">    C_IDLE</w:t>
       </w:r>
     </w:p>
     <w:p>
@@ -11883,7 +10441,7 @@
                 <w:rStyle w:val="HTMLCode"/>
                 <w:rFonts w:eastAsia="Batang"/>
               </w:rPr>
-              <w:t>m_qnsc_wrap_&lt;ip_module&gt;</w:t>
+              <w:t>m_qnsc_wrap_&lt;ip&gt;</w:t>
             </w:r>
           </w:p>
         </w:tc>

</xml_diff>

<commit_message>
docs(rules): v1.2 examples use the project vocabulary (clk, rst)
qnsc_clock_gate, qnsc_reset_sync and u_reset_sync, examples since V1.0,
break rule 1.5 and fail the checker; they are qnsc_clk_gate, qnsc_rst_sync
and u_rst_sync.
</commit_message>
<xml_diff>
--- a/doc/rules/QNSC_RTL_Design_Naming_Rule.docx
+++ b/doc/rules/QNSC_RTL_Design_Naming_Rule.docx
@@ -2622,7 +2622,7 @@
           </w:tcPr>
           <w:p>
             <w:r>
-              <w:t>2.1: chip top m_qnsc_top / m_qnsc_chip, nested wrapper, packages qnsc_&lt;function&gt;_pkg. 2.3: function locals and struct fields. New 2.6 type, 2.7 file, 2.8 technology cell. 3.1/3.2: role as domain in generic modules. 3.3/3.4: buses with several ports, structs inside a block. 4.3: checklist</w:t>
+              <w:t>2.1: chip top m_qnsc_top / m_qnsc_chip, nested wrapper, packages qnsc_&lt;function&gt;_pkg. 2.3: function locals and struct fields. New 2.6 type, 2.7 file, 2.8 technology cell. 3.1/3.2: role as domain in generic modules. 3.3/3.4: buses with several ports, structs inside a block. 4.3: checklist. Examples qnsc_clk_gate, qnsc_rst_sync, u_rst_sync follow 1.5</w:t>
             </w:r>
           </w:p>
         </w:tc>
@@ -5156,7 +5156,7 @@
         <w:rPr>
           <w:rStyle w:val="HTMLCode"/>
         </w:rPr>
-        <w:t>clock_gate</w:t>
+        <w:t>clk_gate</w:t>
       </w:r>
     </w:p>
     <w:p>
@@ -5174,7 +5174,7 @@
         <w:rPr>
           <w:rStyle w:val="HTMLCode"/>
         </w:rPr>
-        <w:t>reset_sync</w:t>
+        <w:t>rst_sync</w:t>
       </w:r>
     </w:p>
     <w:p>
@@ -5489,7 +5489,7 @@
         <w:rPr>
           <w:rStyle w:val="HTMLCode"/>
         </w:rPr>
-        <w:t>u_reset_sync</w:t>
+        <w:t>u_rst_sync</w:t>
       </w:r>
     </w:p>
     <w:p/>
@@ -6502,7 +6502,7 @@
           <w:rStyle w:val="HTMLCode"/>
           <w:lang w:val="en-US"/>
         </w:rPr>
-        <w:t>qnsc_clock_gate</w:t>
+        <w:t>qnsc_clk_gate</w:t>
       </w:r>
     </w:p>
     <w:p>
@@ -6514,7 +6514,7 @@
           <w:rStyle w:val="HTMLCode"/>
           <w:lang w:val="en-US"/>
         </w:rPr>
-        <w:t>qnsc_clock_buf</w:t>
+        <w:t>qnsc_clk_buf</w:t>
       </w:r>
     </w:p>
     <w:p>
@@ -6526,7 +6526,7 @@
           <w:rStyle w:val="HTMLCode"/>
           <w:lang w:val="en-US"/>
         </w:rPr>
-        <w:t>qnsc_clock_mux2</w:t>
+        <w:t>qnsc_clk_mux</w:t>
       </w:r>
     </w:p>
     <w:p>

</xml_diff>

<commit_message>
docs(rules): v1.2 section 2.8 states the rule only
How a technology library is added and chosen is design method, not
naming: it lives in design/common/tech/README.md (#63).
</commit_message>
<xml_diff>
--- a/doc/rules/QNSC_RTL_Design_Naming_Rule.docx
+++ b/doc/rules/QNSC_RTL_Design_Naming_Rule.docx
@@ -6470,7 +6470,7 @@
         <w:pStyle w:val="NormalWeb"/>
       </w:pPr>
       <w:r>
-        <w:t>RTL shall not instantiate a cell of a technology library (standard cell, I/O pad, memory macro) directly. Each such cell is reached through a generic module with a fixed name and fixed ports:</w:t>
+        <w:t>RTL shall not instantiate a cell of a technology library (standard cell, I/O pad, memory macro) directly. It instantiates a generic module, which each technology implements with the same name and ports:</w:t>
       </w:r>
     </w:p>
     <w:p>
@@ -6526,7 +6526,15 @@
           <w:rStyle w:val="HTMLCode"/>
           <w:lang w:val="en-US"/>
         </w:rPr>
-        <w:t>qnsc_clk_mux</w:t>
+        <w:t>qnsc_clk_inv</w:t>
+      </w:r>
+    </w:p>
+    <w:p>
+      <w:pPr>
+        <w:pStyle w:val="NormalWeb"/>
+      </w:pPr>
+      <w:r>
+        <w:t>Inside an implementation, the library cell keeps its own name and pins, and its instance shall use:</w:t>
       </w:r>
     </w:p>
     <w:p>
@@ -6538,31 +6546,7 @@
           <w:rStyle w:val="HTMLCode"/>
           <w:lang w:val="en-US"/>
         </w:rPr>
-        <w:t>qnsc_sync</w:t>
-      </w:r>
-    </w:p>
-    <w:p>
-      <w:pPr>
-        <w:pStyle w:val="HTMLPreformatted"/>
-      </w:pPr>
-      <w:r>
-        <w:rPr>
-          <w:rStyle w:val="HTMLCode"/>
-          <w:lang w:val="en-US"/>
-        </w:rPr>
-        <w:t>qnsc_pad_io</w:t>
-      </w:r>
-    </w:p>
-    <w:p>
-      <w:pPr>
-        <w:pStyle w:val="HTMLPreformatted"/>
-      </w:pPr>
-      <w:r>
-        <w:rPr>
-          <w:rStyle w:val="HTMLCode"/>
-          <w:lang w:val="en-US"/>
-        </w:rPr>
-        <w:t>qnsc_sram_sp</w:t>
+        <w:t>u_size_only_&lt;function&gt;</w:t>
       </w:r>
     </w:p>
     <w:p>
@@ -6570,47 +6554,7 @@
         <w:pStyle w:val="NormalWeb"/>
       </w:pPr>
       <w:r>
-        <w:t>Each technology (generic for simulation and FPGA, one per ASIC library) implements the same module with the same name and ports, and the build selects one. The library cell keeps its own name and pin names, which appear only inside that implementation. Its instance shall use:</w:t>
-      </w:r>
-    </w:p>
-    <w:p>
-      <w:pPr>
-        <w:pStyle w:val="HTMLPreformatted"/>
-      </w:pPr>
-      <w:r>
-        <w:rPr>
-          <w:rStyle w:val="HTMLCode"/>
-          <w:lang w:val="en-US"/>
-        </w:rPr>
-        <w:t>u_size_only_&lt;function&gt;</w:t>
-      </w:r>
-    </w:p>
-    <w:p>
-      <w:pPr>
-        <w:pStyle w:val="NormalWeb"/>
-      </w:pPr>
-      <w:r>
-        <w:t>so that synthesis can preserve it by name. Example:</w:t>
-      </w:r>
-    </w:p>
-    <w:p>
-      <w:pPr>
-        <w:pStyle w:val="HTMLPreformatted"/>
-      </w:pPr>
-      <w:r>
-        <w:rPr>
-          <w:rStyle w:val="HTMLCode"/>
-          <w:lang w:val="en-US"/>
-        </w:rPr>
-        <w:t>PREICG_X1B_A9TS_C31 u_size_only_icg (.CK(i_clk_src), .E(i_en), .SE(i_dft_scan_en), .ECK(o_clk_gated));</w:t>
-      </w:r>
-    </w:p>
-    <w:p>
-      <w:pPr>
-        <w:pStyle w:val="NormalWeb"/>
-      </w:pPr>
-      <w:r>
-        <w:t>A cell that a vendored IP instantiates by its own name (prim_clock_gating, tc_clk_gating, pulp_clock_gating) keeps that name and is implemented on the qnsc_ cell.</w:t>
+        <w:t>so that synthesis can preserve it by name. How a technology is added and chosen: design/common/tech/README.md.</w:t>
       </w:r>
     </w:p>
     <w:p/>
@@ -11733,7 +11677,7 @@
           </w:tcPr>
           <w:p>
             <w:r>
-              <w:t>Shall be reached through qnsc_&lt;function&gt;; library cell instance u_size_only_&lt;function&gt;</w:t>
+              <w:t>Shall be instantiated through qnsc_&lt;function&gt;; the library cell only inside, as u_size_only_&lt;function&gt;</w:t>
             </w:r>
           </w:p>
         </w:tc>

</xml_diff>